<commit_message>
feat: add tiles/list view toggle, evaluation metrics (F1, NDCG, Precision, Recall), remove dead code, update report
- Add toggleable Tiles (grid) and List view for recommendation results
- Persist search results in session state so view toggle doesn't reset query
- Add evaluation metrics panel: F1 Score, Genre Precision@K, Author Recall, NDCG@K, Mean Match Score, Coverage
- Remove dead CSS (.view-toggle-bar, .view-toggle-btn) after switching to st.radio
- Update project report (docx) with new sections: view toggle, evaluation metrics, updated statistics
- HTML-escape dynamic content in tile cards to prevent rendering issues
</commit_message>
<xml_diff>
--- a/AI PROJECT 1 REPORT.docx
+++ b/AI PROJECT 1 REPORT.docx
@@ -7621,6 +7621,551 @@
         </w:rPr>
       </w:pPr>
     </w:p>
+    <w:p>
+      <w:pPr>
+        <w:pStyle w:val="Heading1"/>
+      </w:pPr>
+      <w:r>
+        <w:t>11. New Feature: Tiles / List View Toggle</w:t>
+      </w:r>
+    </w:p>
+    <w:p>
+      <w:r>
+        <w:rPr>
+          <w:rFonts w:ascii="Calibri" w:hAnsi="Calibri"/>
+          <w:b w:val="0"/>
+          <w:sz w:val="22"/>
+        </w:rPr>
+        <w:t>A new UI feature has been added that allows users to toggle between two view modes for recommendation results:</w:t>
+      </w:r>
+    </w:p>
+    <w:p>
+      <w:r>
+        <w:rPr>
+          <w:b/>
+          <w:sz w:val="22"/>
+        </w:rPr>
+        <w:t xml:space="preserve">• Tiles View: </w:t>
+      </w:r>
+      <w:r>
+        <w:rPr>
+          <w:sz w:val="22"/>
+        </w:rPr>
+        <w:t>A responsive grid layout showing book covers prominently with title, author, rating badges, and match-score pills overlaid on the cover image. This view is ideal for visual browsing and quick scanning.</w:t>
+      </w:r>
+    </w:p>
+    <w:p>
+      <w:r>
+        <w:rPr>
+          <w:b/>
+          <w:sz w:val="22"/>
+        </w:rPr>
+        <w:t xml:space="preserve">• List View: </w:t>
+      </w:r>
+      <w:r>
+        <w:rPr>
+          <w:sz w:val="22"/>
+        </w:rPr>
+        <w:t>The original horizontal card layout with detailed descriptions, score bars, genre/rating badges, and expandable descriptions. This view is ideal for detailed information review.</w:t>
+      </w:r>
+    </w:p>
+    <w:p>
+      <w:r>
+        <w:rPr>
+          <w:rFonts w:ascii="Calibri" w:hAnsi="Calibri"/>
+          <w:b w:val="0"/>
+          <w:sz w:val="22"/>
+        </w:rPr>
+        <w:t>The toggle is implemented using Streamlit's st.radio widget with horizontal layout. The selected view mode is persisted in Streamlit session state, ensuring that toggling between views does not cause the search results to be lost. All recommendation data is cached in st.session_state and displayed from cache, allowing seamless switching without re-executing the search query.</w:t>
+      </w:r>
+    </w:p>
+    <w:p>
+      <w:r>
+        <w:rPr>
+          <w:rFonts w:ascii="Calibri" w:hAnsi="Calibri"/>
+          <w:b/>
+          <w:sz w:val="22"/>
+        </w:rPr>
+        <w:t>Implementation Details:</w:t>
+      </w:r>
+    </w:p>
+    <w:p>
+      <w:r>
+        <w:rPr>
+          <w:rFonts w:ascii="Calibri" w:hAnsi="Calibri"/>
+          <w:b w:val="0"/>
+          <w:sz w:val="22"/>
+        </w:rPr>
+        <w:t>The tile view renders all book cards as a single HTML block using a CSS Grid layout (grid-template-columns: repeat(auto-fill, minmax(180px, 1fr))), ensuring responsive behavior across different screen sizes. Each tile card includes cover image with lazy loading, rank overlay, match percentage pill, title (clamped to 2 lines), author, and genre/rating badges. HTML escaping (html.escape()) is applied to all dynamic content to prevent XSS and rendering issues.</w:t>
+      </w:r>
+    </w:p>
+    <w:p>
+      <w:pPr>
+        <w:pStyle w:val="Heading1"/>
+      </w:pPr>
+      <w:r>
+        <w:t>12. Evaluation Metrics</w:t>
+      </w:r>
+    </w:p>
+    <w:p>
+      <w:r>
+        <w:rPr>
+          <w:rFonts w:ascii="Calibri" w:hAnsi="Calibri"/>
+          <w:b w:val="0"/>
+          <w:sz w:val="22"/>
+        </w:rPr>
+        <w:t>To quantitatively assess the quality of recommendations, the system now computes and displays the following evaluation metrics after each search. These metrics are shown in a collapsible "Evaluation Metrics" panel below the results.</w:t>
+      </w:r>
+    </w:p>
+    <w:p>
+      <w:r>
+        <w:rPr>
+          <w:rFonts w:ascii="Calibri" w:hAnsi="Calibri"/>
+          <w:b/>
+          <w:sz w:val="22"/>
+        </w:rPr>
+        <w:t>12.1 Genre Precision@K</w:t>
+      </w:r>
+    </w:p>
+    <w:p>
+      <w:r>
+        <w:rPr>
+          <w:rFonts w:ascii="Calibri" w:hAnsi="Calibri"/>
+          <w:b w:val="0"/>
+          <w:sz w:val="22"/>
+        </w:rPr>
+        <w:t>Measures the fraction of the top-K recommended books whose genre matches the target genre. A value of 1.0 means all recommended books are in the desired genre.</w:t>
+      </w:r>
+    </w:p>
+    <w:p>
+      <w:r>
+        <w:rPr>
+          <w:rFonts w:ascii="Calibri" w:hAnsi="Calibri"/>
+          <w:b w:val="0"/>
+          <w:sz w:val="22"/>
+        </w:rPr>
+        <w:t>Formula: Genre Precision@K = (Number of results matching target genre) / K</w:t>
+      </w:r>
+    </w:p>
+    <w:p>
+      <w:r>
+        <w:rPr>
+          <w:rFonts w:ascii="Calibri" w:hAnsi="Calibri"/>
+          <w:b/>
+          <w:sz w:val="22"/>
+        </w:rPr>
+        <w:t>12.2 Author Recall</w:t>
+      </w:r>
+    </w:p>
+    <w:p>
+      <w:r>
+        <w:rPr>
+          <w:rFonts w:ascii="Calibri" w:hAnsi="Calibri"/>
+          <w:b w:val="0"/>
+          <w:sz w:val="22"/>
+        </w:rPr>
+        <w:t>Measures the fraction of the top-K results written by the target author. This captures whether the system successfully retrieves books by the preferred author.</w:t>
+      </w:r>
+    </w:p>
+    <w:p>
+      <w:r>
+        <w:rPr>
+          <w:rFonts w:ascii="Calibri" w:hAnsi="Calibri"/>
+          <w:b w:val="0"/>
+          <w:sz w:val="22"/>
+        </w:rPr>
+        <w:t>Formula: Author Recall = (Number of results by target author) / K</w:t>
+      </w:r>
+    </w:p>
+    <w:p>
+      <w:r>
+        <w:rPr>
+          <w:rFonts w:ascii="Calibri" w:hAnsi="Calibri"/>
+          <w:b/>
+          <w:sz w:val="22"/>
+        </w:rPr>
+        <w:t>12.3 F1 Score</w:t>
+      </w:r>
+    </w:p>
+    <w:p>
+      <w:r>
+        <w:rPr>
+          <w:rFonts w:ascii="Calibri" w:hAnsi="Calibri"/>
+          <w:b w:val="0"/>
+          <w:sz w:val="22"/>
+        </w:rPr>
+        <w:t>The harmonic mean of Genre Precision and Author Recall, providing a balanced measure that accounts for both precision and recall simultaneously.</w:t>
+      </w:r>
+    </w:p>
+    <w:p>
+      <w:r>
+        <w:rPr>
+          <w:rFonts w:ascii="Calibri" w:hAnsi="Calibri"/>
+          <w:b w:val="0"/>
+          <w:sz w:val="22"/>
+        </w:rPr>
+        <w:t>Formula: F1 = 2 × (Precision × Recall) / (Precision + Recall)</w:t>
+      </w:r>
+    </w:p>
+    <w:p>
+      <w:r>
+        <w:rPr>
+          <w:rFonts w:ascii="Calibri" w:hAnsi="Calibri"/>
+          <w:b/>
+          <w:sz w:val="22"/>
+        </w:rPr>
+        <w:t>12.4 NDCG@K (Normalized Discounted Cumulative Gain)</w:t>
+      </w:r>
+    </w:p>
+    <w:p>
+      <w:r>
+        <w:rPr>
+          <w:rFonts w:ascii="Calibri" w:hAnsi="Calibri"/>
+          <w:b w:val="0"/>
+          <w:sz w:val="22"/>
+        </w:rPr>
+        <w:t>Evaluates the ranking quality of the recommendation list. It uses the heuristic scores as relevance values and compares the actual ranking against the ideal (perfectly sorted) ranking. A value of 1.0 indicates that the results are in the optimal order.</w:t>
+      </w:r>
+    </w:p>
+    <w:p>
+      <w:r>
+        <w:rPr>
+          <w:rFonts w:ascii="Calibri" w:hAnsi="Calibri"/>
+          <w:b w:val="0"/>
+          <w:sz w:val="22"/>
+        </w:rPr>
+        <w:t>Formula: DCG@K = Σ(i=1 to K) score_i / log₂(i+1); NDCG@K = DCG@K / IDCG@K</w:t>
+      </w:r>
+    </w:p>
+    <w:p>
+      <w:r>
+        <w:rPr>
+          <w:rFonts w:ascii="Calibri" w:hAnsi="Calibri"/>
+          <w:b/>
+          <w:sz w:val="22"/>
+        </w:rPr>
+        <w:t>12.5 Mean Match Score</w:t>
+      </w:r>
+    </w:p>
+    <w:p>
+      <w:r>
+        <w:rPr>
+          <w:rFonts w:ascii="Calibri" w:hAnsi="Calibri"/>
+          <w:b w:val="0"/>
+          <w:sz w:val="22"/>
+        </w:rPr>
+        <w:t>The average heuristic score across all K results. Since the heuristic is h(n) = 0.6 × genre_match + 0.4 × author_match, this metric indicates the overall relevance quality of the recommendation set. A value of 1.0 means all results perfectly match both genre and author.</w:t>
+      </w:r>
+    </w:p>
+    <w:p>
+      <w:r>
+        <w:rPr>
+          <w:rFonts w:ascii="Calibri" w:hAnsi="Calibri"/>
+          <w:b/>
+          <w:sz w:val="22"/>
+        </w:rPr>
+        <w:t>12.6 Coverage Metrics</w:t>
+      </w:r>
+    </w:p>
+    <w:p>
+      <w:r>
+        <w:rPr>
+          <w:rFonts w:ascii="Calibri" w:hAnsi="Calibri"/>
+          <w:b w:val="0"/>
+          <w:sz w:val="22"/>
+        </w:rPr>
+        <w:t>Two coverage metrics are reported: (1) Unique Genres — the number of distinct genres in the result set, indicating genre diversity; (2) Unique Authors — the number of distinct authors, indicating author diversity. High coverage with high precision indicates that the system provides diverse yet relevant recommendations.</w:t>
+      </w:r>
+    </w:p>
+    <w:p>
+      <w:r>
+        <w:rPr>
+          <w:rFonts w:ascii="Calibri" w:hAnsi="Calibri"/>
+          <w:b/>
+          <w:sz w:val="22"/>
+        </w:rPr>
+        <w:t>12.7 Metric Computation Code</w:t>
+      </w:r>
+    </w:p>
+    <w:p>
+      <w:r>
+        <w:rPr>
+          <w:rFonts w:ascii="Consolas" w:hAnsi="Consolas"/>
+          <w:sz w:val="18"/>
+        </w:rPr>
+        <w:t>def compute_metrics(results_df, target_genre, target_author):</w:t>
+        <w:br/>
+        <w:t xml:space="preserve">    k = len(results_df)</w:t>
+        <w:br/>
+        <w:t xml:space="preserve">    scores = results_df['Score'].tolist()</w:t>
+        <w:br/>
+        <w:t xml:space="preserve">    genre_precision = sum(1 for g in results_df['Genre']</w:t>
+        <w:br/>
+        <w:t xml:space="preserve">        if target_genre.lower() in str(g).lower()) / k</w:t>
+        <w:br/>
+        <w:t xml:space="preserve">    author_recall = sum(1 for a in results_df['Author']</w:t>
+        <w:br/>
+        <w:t xml:space="preserve">        if target_author.lower() in str(a).lower()) / k</w:t>
+        <w:br/>
+        <w:t xml:space="preserve">    f1 = 2 * (genre_precision * author_recall) /</w:t>
+        <w:br/>
+        <w:t xml:space="preserve">        (genre_precision + author_recall)</w:t>
+        <w:br/>
+        <w:t xml:space="preserve">    # NDCG@K</w:t>
+        <w:br/>
+        <w:t xml:space="preserve">    dcg = sum(s / log2(i+2) for i, s in enumerate(scores))</w:t>
+        <w:br/>
+        <w:t xml:space="preserve">    idcg = sum(s / log2(i+2) for i, s in enumerate(sorted(scores, reverse=True)))</w:t>
+        <w:br/>
+        <w:t xml:space="preserve">    ndcg = dcg / idcg if idcg &gt; 0 else 0.0</w:t>
+        <w:br/>
+        <w:t xml:space="preserve">    return {'F1': f1, 'Precision': genre_precision,</w:t>
+        <w:br/>
+        <w:t xml:space="preserve">            'Recall': author_recall, 'NDCG': ndcg}</w:t>
+      </w:r>
+    </w:p>
+    <w:p>
+      <w:pPr>
+        <w:pStyle w:val="Heading1"/>
+      </w:pPr>
+      <w:r>
+        <w:t>13. Updated System Statistics</w:t>
+      </w:r>
+    </w:p>
+    <w:p>
+      <w:r>
+        <w:rPr>
+          <w:rFonts w:ascii="Calibri" w:hAnsi="Calibri"/>
+          <w:b w:val="0"/>
+          <w:sz w:val="22"/>
+        </w:rPr>
+        <w:t>The system has been significantly expanded from its original 115-book sample dataset:</w:t>
+      </w:r>
+    </w:p>
+    <w:tbl>
+      <w:tblPr>
+        <w:tblW w:type="auto" w:w="0"/>
+        <w:tblLook w:firstColumn="1" w:firstRow="1" w:lastColumn="0" w:lastRow="0" w:noHBand="0" w:noVBand="1" w:val="04A0"/>
+      </w:tblPr>
+      <w:tblGrid>
+        <w:gridCol w:w="3120"/>
+        <w:gridCol w:w="3120"/>
+        <w:gridCol w:w="3120"/>
+      </w:tblGrid>
+      <w:tr>
+        <w:tc>
+          <w:tcPr>
+            <w:tcW w:type="dxa" w:w="3120"/>
+          </w:tcPr>
+          <w:p>
+            <w:r>
+              <w:t>Total Books</w:t>
+            </w:r>
+          </w:p>
+        </w:tc>
+        <w:tc>
+          <w:tcPr>
+            <w:tcW w:type="dxa" w:w="3120"/>
+          </w:tcPr>
+          <w:p>
+            <w:r>
+              <w:t>115</w:t>
+            </w:r>
+          </w:p>
+        </w:tc>
+        <w:tc>
+          <w:tcPr>
+            <w:tcW w:type="dxa" w:w="3120"/>
+          </w:tcPr>
+          <w:p>
+            <w:r>
+              <w:t>15,309</w:t>
+            </w:r>
+          </w:p>
+        </w:tc>
+      </w:tr>
+      <w:tr>
+        <w:tc>
+          <w:tcPr>
+            <w:tcW w:type="dxa" w:w="3120"/>
+          </w:tcPr>
+          <w:p>
+            <w:r>
+              <w:t>Genres</w:t>
+            </w:r>
+          </w:p>
+        </w:tc>
+        <w:tc>
+          <w:tcPr>
+            <w:tcW w:type="dxa" w:w="3120"/>
+          </w:tcPr>
+          <w:p>
+            <w:r>
+              <w:t>14</w:t>
+            </w:r>
+          </w:p>
+        </w:tc>
+        <w:tc>
+          <w:tcPr>
+            <w:tcW w:type="dxa" w:w="3120"/>
+          </w:tcPr>
+          <w:p>
+            <w:r>
+              <w:t>234</w:t>
+            </w:r>
+          </w:p>
+        </w:tc>
+      </w:tr>
+      <w:tr>
+        <w:tc>
+          <w:tcPr>
+            <w:tcW w:type="dxa" w:w="3120"/>
+          </w:tcPr>
+          <w:p>
+            <w:r>
+              <w:t>Data Source</w:t>
+            </w:r>
+          </w:p>
+        </w:tc>
+        <w:tc>
+          <w:tcPr>
+            <w:tcW w:type="dxa" w:w="3120"/>
+          </w:tcPr>
+          <w:p>
+            <w:r>
+              <w:t>Built-in sample</w:t>
+            </w:r>
+          </w:p>
+        </w:tc>
+        <w:tc>
+          <w:tcPr>
+            <w:tcW w:type="dxa" w:w="3120"/>
+          </w:tcPr>
+          <w:p>
+            <w:r>
+              <w:t>GoodReads CSV (100K filtered)</w:t>
+            </w:r>
+          </w:p>
+        </w:tc>
+      </w:tr>
+      <w:tr>
+        <w:tc>
+          <w:tcPr>
+            <w:tcW w:type="dxa" w:w="3120"/>
+          </w:tcPr>
+          <w:p>
+            <w:r>
+              <w:t>UI Theme</w:t>
+            </w:r>
+          </w:p>
+        </w:tc>
+        <w:tc>
+          <w:tcPr>
+            <w:tcW w:type="dxa" w:w="3120"/>
+          </w:tcPr>
+          <w:p>
+            <w:r>
+              <w:t>Basic Streamlit</w:t>
+            </w:r>
+          </w:p>
+        </w:tc>
+        <w:tc>
+          <w:tcPr>
+            <w:tcW w:type="dxa" w:w="3120"/>
+          </w:tcPr>
+          <w:p>
+            <w:r>
+              <w:t>Glassmorphism (Dark/Light)</w:t>
+            </w:r>
+          </w:p>
+        </w:tc>
+      </w:tr>
+      <w:tr>
+        <w:tc>
+          <w:tcPr>
+            <w:tcW w:type="dxa" w:w="3120"/>
+          </w:tcPr>
+          <w:p>
+            <w:r>
+              <w:t>View Modes</w:t>
+            </w:r>
+          </w:p>
+        </w:tc>
+        <w:tc>
+          <w:tcPr>
+            <w:tcW w:type="dxa" w:w="3120"/>
+          </w:tcPr>
+          <w:p>
+            <w:r>
+              <w:t>List only</w:t>
+            </w:r>
+          </w:p>
+        </w:tc>
+        <w:tc>
+          <w:tcPr>
+            <w:tcW w:type="dxa" w:w="3120"/>
+          </w:tcPr>
+          <w:p>
+            <w:r>
+              <w:t>Tiles + List (toggleable)</w:t>
+            </w:r>
+          </w:p>
+        </w:tc>
+      </w:tr>
+      <w:tr>
+        <w:tc>
+          <w:tcPr>
+            <w:tcW w:type="dxa" w:w="3120"/>
+          </w:tcPr>
+          <w:p>
+            <w:r>
+              <w:t>Eval Metrics</w:t>
+            </w:r>
+          </w:p>
+        </w:tc>
+        <w:tc>
+          <w:tcPr>
+            <w:tcW w:type="dxa" w:w="3120"/>
+          </w:tcPr>
+          <w:p>
+            <w:r>
+              <w:t>None</w:t>
+            </w:r>
+          </w:p>
+        </w:tc>
+        <w:tc>
+          <w:tcPr>
+            <w:tcW w:type="dxa" w:w="3120"/>
+          </w:tcPr>
+          <w:p>
+            <w:r>
+              <w:t>F1, Precision, Recall, NDCG, Coverage</w:t>
+            </w:r>
+          </w:p>
+        </w:tc>
+      </w:tr>
+      <w:tr>
+        <w:tc>
+          <w:tcPr>
+            <w:tcW w:type="dxa" w:w="3120"/>
+          </w:tcPr>
+          <w:p/>
+        </w:tc>
+        <w:tc>
+          <w:tcPr>
+            <w:tcW w:type="dxa" w:w="3120"/>
+          </w:tcPr>
+          <w:p/>
+        </w:tc>
+        <w:tc>
+          <w:tcPr>
+            <w:tcW w:type="dxa" w:w="3120"/>
+          </w:tcPr>
+          <w:p/>
+        </w:tc>
+      </w:tr>
+    </w:tbl>
+    <w:p/>
     <w:sectPr>
       <w:pgSz w:w="12240" w:h="15840"/>
       <w:pgMar w:top="1440" w:right="1440" w:bottom="1440" w:left="1440" w:header="720" w:footer="720" w:gutter="0"/>

</xml_diff>